<commit_message>
feat: dashboard with the project's footage statistics; three-presenter demo script
</commit_message>
<xml_diff>
--- a/docs/report/CineMind_AI_Project_Report.docx
+++ b/docs/report/CineMind_AI_Project_Report.docx
@@ -10089,7 +10089,7 @@
       <w:r>
         <w:drawing>
           <wp:inline distT="0" distB="0" distL="0" distR="0">
-            <wp:extent cx="4953000" cy="2247900"/>
+            <wp:extent cx="4953000" cy="2143125"/>
             <wp:effectExtent t="0" r="0" b="0" l="0"/>
             <wp:docPr id="4" name="" descr="" title=""/>
             <wp:cNvGraphicFramePr>
@@ -10114,7 +10114,7 @@
                   <pic:spPr bwMode="auto">
                     <a:xfrm>
                       <a:off x="0" y="0"/>
-                      <a:ext cx="4953000" cy="2247900"/>
+                      <a:ext cx="4953000" cy="2143125"/>
                     </a:xfrm>
                     <a:prstGeom prst="rect">
                       <a:avLst/>
@@ -10148,7 +10148,7 @@
         <w:jc w:val="both"/>
       </w:pPr>
       <w:r>
-        <w:t xml:space="preserve">Whisper small lowers WER from 6.60 % to 4.70 % at almost three times the processing time (0.29 s per second of audio, still about 3.4× faster than real time on CPU), so small is the default for the lite tier. On the team's noisy field audio, the uncertainty rule hid the hallucinated lines, but some fluent text that passes the model's own limits remains.</w:t>
+        <w:t xml:space="preserve">Whisper small lowers WER from 6.60 % to 4.70 % (left) at almost three times the processing time (right) (0.29 s per second of audio, still about 3.4× faster than real time on CPU), so small is the default for the lite tier. On the team's noisy field audio, the uncertainty rule hid the hallucinated lines, but some fluent text that passes the model's own limits remains.</w:t>
       </w:r>
     </w:p>
     <w:p>
@@ -14117,7 +14117,7 @@
         <w:spacing w:after="100" w:before="180"/>
       </w:pPr>
       <w:r>
-        <w:t xml:space="preserve">13.1 Library</w:t>
+        <w:t xml:space="preserve">13.1 Dashboard</w:t>
       </w:r>
     </w:p>
     <w:p>
@@ -14126,7 +14126,7 @@
         <w:jc w:val="both"/>
       </w:pPr>
       <w:r>
-        <w:t xml:space="preserve">Import a footage folder (referenced in place, never modified) and follow processing live. Filter and sort clips by technical quality.</w:t>
+        <w:t xml:space="preserve">Footage statistics of the current project: clips, shots, scenes, actors, speech, low-quality shots, take groups, your marks and timelines; processing state, the distribution of technical quality scores with the quality flags, footage formats, speech per language, and suggested next steps.</w:t>
       </w:r>
     </w:p>
     <w:p>
@@ -14137,7 +14137,7 @@
       <w:r>
         <w:drawing>
           <wp:inline distT="0" distB="0" distL="0" distR="0">
-            <wp:extent cx="5334000" cy="3333750"/>
+            <wp:extent cx="5334000" cy="3705225"/>
             <wp:effectExtent t="0" r="0" b="0" l="0"/>
             <wp:docPr id="11" name="" descr="" title=""/>
             <wp:cNvGraphicFramePr>
@@ -14162,7 +14162,7 @@
                   <pic:spPr bwMode="auto">
                     <a:xfrm>
                       <a:off x="0" y="0"/>
-                      <a:ext cx="5334000" cy="3333750"/>
+                      <a:ext cx="5334000" cy="3705225"/>
                     </a:xfrm>
                     <a:prstGeom prst="rect">
                       <a:avLst/>
@@ -14187,7 +14187,7 @@
           <w:sz w:val="18"/>
           <w:szCs w:val="18"/>
         </w:rPr>
-        <w:t xml:space="preserve">Fig. 10. Library page</w:t>
+        <w:t xml:space="preserve">Fig. 10. Dashboard page</w:t>
       </w:r>
     </w:p>
     <w:p>
@@ -14196,7 +14196,7 @@
         <w:spacing w:after="100" w:before="180"/>
       </w:pPr>
       <w:r>
-        <w:t xml:space="preserve">13.2 Clip page</w:t>
+        <w:t xml:space="preserve">13.2 Library</w:t>
       </w:r>
     </w:p>
     <w:p>
@@ -14205,7 +14205,7 @@
         <w:jc w:val="both"/>
       </w:pPr>
       <w:r>
-        <w:t xml:space="preserve">Proxy player with the shot strip, the QC lane of quality flags, the waveform, the transcript with word timings, tags and faces.</w:t>
+        <w:t xml:space="preserve">Import a footage folder (referenced in place, never modified) and follow processing live. Filter and sort clips by technical quality.</w:t>
       </w:r>
     </w:p>
     <w:p>
@@ -14266,7 +14266,7 @@
           <w:sz w:val="18"/>
           <w:szCs w:val="18"/>
         </w:rPr>
-        <w:t xml:space="preserve">Fig. 11. Clip page page</w:t>
+        <w:t xml:space="preserve">Fig. 11. Library page</w:t>
       </w:r>
     </w:p>
     <w:p>
@@ -14275,7 +14275,7 @@
         <w:spacing w:after="100" w:before="180"/>
       </w:pPr>
       <w:r>
-        <w:t xml:space="preserve">13.3 Shots / Scenes</w:t>
+        <w:t xml:space="preserve">13.3 Clip page</w:t>
       </w:r>
     </w:p>
     <w:p>
@@ -14284,7 +14284,7 @@
         <w:jc w:val="both"/>
       </w:pPr>
       <w:r>
-        <w:t xml:space="preserve">Shots grouped into scenes, with the similarity behind each boundary. Split, join and rename scenes, and select or reject shots.</w:t>
+        <w:t xml:space="preserve">Proxy player with the shot strip, the QC lane of quality flags, the waveform, the transcript with word timings, tags and faces.</w:t>
       </w:r>
     </w:p>
     <w:p>
@@ -14345,7 +14345,7 @@
           <w:sz w:val="18"/>
           <w:szCs w:val="18"/>
         </w:rPr>
-        <w:t xml:space="preserve">Fig. 12. Shots / Scenes page</w:t>
+        <w:t xml:space="preserve">Fig. 12. Clip page page</w:t>
       </w:r>
     </w:p>
     <w:p>
@@ -14354,7 +14354,7 @@
         <w:spacing w:after="100" w:before="180"/>
       </w:pPr>
       <w:r>
-        <w:t xml:space="preserve">13.4 Actors</w:t>
+        <w:t xml:space="preserve">13.4 Shots / Scenes</w:t>
       </w:r>
     </w:p>
     <w:p>
@@ -14363,7 +14363,7 @@
         <w:jc w:val="both"/>
       </w:pPr>
       <w:r>
-        <w:t xml:space="preserve">Faces grouped into people. Rename, merge and split groups, and answer 'Same person?' questions.</w:t>
+        <w:t xml:space="preserve">Shots grouped into scenes, with the similarity behind each boundary. Split, join and rename scenes, and select or reject shots.</w:t>
       </w:r>
     </w:p>
     <w:p>
@@ -14424,7 +14424,7 @@
           <w:sz w:val="18"/>
           <w:szCs w:val="18"/>
         </w:rPr>
-        <w:t xml:space="preserve">Fig. 13. Actors page</w:t>
+        <w:t xml:space="preserve">Fig. 13. Shots / Scenes page</w:t>
       </w:r>
     </w:p>
     <w:p>
@@ -14433,7 +14433,7 @@
         <w:spacing w:after="100" w:before="180"/>
       </w:pPr>
       <w:r>
-        <w:t xml:space="preserve">13.5 Transcripts</w:t>
+        <w:t xml:space="preserve">13.5 Actors</w:t>
       </w:r>
     </w:p>
     <w:p>
@@ -14442,7 +14442,7 @@
         <w:jc w:val="both"/>
       </w:pPr>
       <w:r>
-        <w:t xml:space="preserve">Spoken languages per project, the transcript of every clip and keyword search over all of them.</w:t>
+        <w:t xml:space="preserve">Faces grouped into people. Rename, merge and split groups, and answer 'Same person?' questions.</w:t>
       </w:r>
     </w:p>
     <w:p>
@@ -14503,7 +14503,7 @@
           <w:sz w:val="18"/>
           <w:szCs w:val="18"/>
         </w:rPr>
-        <w:t xml:space="preserve">Fig. 14. Transcripts page</w:t>
+        <w:t xml:space="preserve">Fig. 14. Actors page</w:t>
       </w:r>
     </w:p>
     <w:p>
@@ -14512,7 +14512,7 @@
         <w:spacing w:after="100" w:before="180"/>
       </w:pPr>
       <w:r>
-        <w:t xml:space="preserve">13.6 Search</w:t>
+        <w:t xml:space="preserve">13.6 Transcripts</w:t>
       </w:r>
     </w:p>
     <w:p>
@@ -14521,7 +14521,7 @@
         <w:jc w:val="both"/>
       </w:pPr>
       <w:r>
-        <w:t xml:space="preserve">Type a query or search by picture. Each card shows the score breakdown, and 'Ranking weights' changes the weights for one search.</w:t>
+        <w:t xml:space="preserve">Spoken languages per project, the transcript of every clip and keyword search over all of them.</w:t>
       </w:r>
     </w:p>
     <w:p>
@@ -14582,7 +14582,7 @@
           <w:sz w:val="18"/>
           <w:szCs w:val="18"/>
         </w:rPr>
-        <w:t xml:space="preserve">Fig. 15. Search page</w:t>
+        <w:t xml:space="preserve">Fig. 15. Transcripts page</w:t>
       </w:r>
     </w:p>
     <w:p>
@@ -14591,7 +14591,7 @@
         <w:spacing w:after="100" w:before="180"/>
       </w:pPr>
       <w:r>
-        <w:t xml:space="preserve">13.7 Takes</w:t>
+        <w:t xml:space="preserve">13.7 Search</w:t>
       </w:r>
     </w:p>
     <w:p>
@@ -14600,7 +14600,7 @@
         <w:jc w:val="both"/>
       </w:pPr>
       <w:r>
-        <w:t xml:space="preserve">Repeated takes with the suggested best take and its signals. Make another take the best, or take a shot out of the group.</w:t>
+        <w:t xml:space="preserve">Type a query or search by picture. Each card shows the score breakdown, and 'Ranking weights' changes the weights for one search.</w:t>
       </w:r>
     </w:p>
     <w:p>
@@ -14661,7 +14661,7 @@
           <w:sz w:val="18"/>
           <w:szCs w:val="18"/>
         </w:rPr>
-        <w:t xml:space="preserve">Fig. 16. Takes page</w:t>
+        <w:t xml:space="preserve">Fig. 16. Search page</w:t>
       </w:r>
     </w:p>
     <w:p>
@@ -14670,7 +14670,7 @@
         <w:spacing w:after="100" w:before="180"/>
       </w:pPr>
       <w:r>
-        <w:t xml:space="preserve">13.8 Script</w:t>
+        <w:t xml:space="preserve">13.8 Takes</w:t>
       </w:r>
     </w:p>
     <w:p>
@@ -14679,7 +14679,7 @@
         <w:jc w:val="both"/>
       </w:pPr>
       <w:r>
-        <w:t xml:space="preserve">Paste a screenplay. Every dialogue line gets its takes, and 'Build script assembly' creates a timeline.</w:t>
+        <w:t xml:space="preserve">Repeated takes with the suggested best take and its signals. Make another take the best, or take a shot out of the group.</w:t>
       </w:r>
     </w:p>
     <w:p>
@@ -14740,7 +14740,7 @@
           <w:sz w:val="18"/>
           <w:szCs w:val="18"/>
         </w:rPr>
-        <w:t xml:space="preserve">Fig. 17. Script page</w:t>
+        <w:t xml:space="preserve">Fig. 17. Takes page</w:t>
       </w:r>
     </w:p>
     <w:p>
@@ -14749,7 +14749,7 @@
         <w:spacing w:after="100" w:before="180"/>
       </w:pPr>
       <w:r>
-        <w:t xml:space="preserve">13.9 Timeline</w:t>
+        <w:t xml:space="preserve">13.9 Script</w:t>
       </w:r>
     </w:p>
     <w:p>
@@ -14758,7 +14758,7 @@
         <w:jc w:val="both"/>
       </w:pPr>
       <w:r>
-        <w:t xml:space="preserve">Write a brief and optionally set length, order, person and scene, then build an AI-assisted rough cut.</w:t>
+        <w:t xml:space="preserve">Paste a screenplay. Every dialogue line gets its takes, and 'Build script assembly' creates a timeline.</w:t>
       </w:r>
     </w:p>
     <w:p>
@@ -14819,7 +14819,7 @@
           <w:sz w:val="18"/>
           <w:szCs w:val="18"/>
         </w:rPr>
-        <w:t xml:space="preserve">Fig. 18. Timeline page</w:t>
+        <w:t xml:space="preserve">Fig. 18. Script page</w:t>
       </w:r>
     </w:p>
     <w:p>
@@ -14828,7 +14828,7 @@
         <w:spacing w:after="100" w:before="180"/>
       </w:pPr>
       <w:r>
-        <w:t xml:space="preserve">13.10 Timeline editor</w:t>
+        <w:t xml:space="preserve">13.10 Timeline</w:t>
       </w:r>
     </w:p>
     <w:p>
@@ -14837,7 +14837,7 @@
         <w:jc w:val="both"/>
       </w:pPr>
       <w:r>
-        <w:t xml:space="preserve">Reorder by drag-and-drop, trim, remove, swap with suggestions (other takes first) and play the cut. Every clip shows why it was chosen.</w:t>
+        <w:t xml:space="preserve">Write a brief and optionally set length, order, person and scene, then build an AI-assisted rough cut.</w:t>
       </w:r>
     </w:p>
     <w:p>
@@ -14898,7 +14898,7 @@
           <w:sz w:val="18"/>
           <w:szCs w:val="18"/>
         </w:rPr>
-        <w:t xml:space="preserve">Fig. 19. Timeline editor page</w:t>
+        <w:t xml:space="preserve">Fig. 19. Timeline page</w:t>
       </w:r>
     </w:p>
     <w:p>
@@ -14907,7 +14907,7 @@
         <w:spacing w:after="100" w:before="180"/>
       </w:pPr>
       <w:r>
-        <w:t xml:space="preserve">13.11 Export</w:t>
+        <w:t xml:space="preserve">13.11 Timeline editor</w:t>
       </w:r>
     </w:p>
     <w:p>
@@ -14916,7 +14916,7 @@
         <w:jc w:val="both"/>
       </w:pPr>
       <w:r>
-        <w:t xml:space="preserve">Export FCP7 XML (for DaVinci Resolve), EDL, OTIO and SRT. In Resolve choose File → Import → Timeline.</w:t>
+        <w:t xml:space="preserve">Reorder by drag-and-drop, trim, remove, swap with suggestions (other takes first) and play the cut. Every clip shows why it was chosen.</w:t>
       </w:r>
     </w:p>
     <w:p>
@@ -14977,7 +14977,86 @@
           <w:sz w:val="18"/>
           <w:szCs w:val="18"/>
         </w:rPr>
-        <w:t xml:space="preserve">Fig. 20. Export page</w:t>
+        <w:t xml:space="preserve">Fig. 20. Timeline editor page</w:t>
+      </w:r>
+    </w:p>
+    <w:p>
+      <w:pPr>
+        <w:pStyle w:val="Heading2"/>
+        <w:spacing w:after="100" w:before="180"/>
+      </w:pPr>
+      <w:r>
+        <w:t xml:space="preserve">13.12 Export</w:t>
+      </w:r>
+    </w:p>
+    <w:p>
+      <w:pPr>
+        <w:spacing w:after="120" w:line="300"/>
+        <w:jc w:val="both"/>
+      </w:pPr>
+      <w:r>
+        <w:t xml:space="preserve">Export FCP7 XML (for DaVinci Resolve), EDL, OTIO and SRT. In Resolve choose File → Import → Timeline.</w:t>
+      </w:r>
+    </w:p>
+    <w:p>
+      <w:pPr>
+        <w:spacing w:after="60"/>
+        <w:jc w:val="center"/>
+      </w:pPr>
+      <w:r>
+        <w:drawing>
+          <wp:inline distT="0" distB="0" distL="0" distR="0">
+            <wp:extent cx="5334000" cy="3333750"/>
+            <wp:effectExtent t="0" r="0" b="0" l="0"/>
+            <wp:docPr id="22" name="" descr="" title=""/>
+            <wp:cNvGraphicFramePr>
+              <a:graphicFrameLocks xmlns:a="http://schemas.openxmlformats.org/drawingml/2006/main" noChangeAspect="1"/>
+            </wp:cNvGraphicFramePr>
+            <a:graphic xmlns:a="http://schemas.openxmlformats.org/drawingml/2006/main">
+              <a:graphicData uri="http://schemas.openxmlformats.org/drawingml/2006/picture">
+                <pic:pic xmlns:pic="http://schemas.openxmlformats.org/drawingml/2006/picture">
+                  <pic:nvPicPr>
+                    <pic:cNvPr id="0" name="" descr=""/>
+                    <pic:cNvPicPr>
+                      <a:picLocks noChangeAspect="1" noChangeArrowheads="1"/>
+                    </pic:cNvPicPr>
+                  </pic:nvPicPr>
+                  <pic:blipFill>
+                    <a:blip r:embed="rId29" cstate="none"/>
+                    <a:srcRect/>
+                    <a:stretch>
+                      <a:fillRect/>
+                    </a:stretch>
+                  </pic:blipFill>
+                  <pic:spPr bwMode="auto">
+                    <a:xfrm>
+                      <a:off x="0" y="0"/>
+                      <a:ext cx="5334000" cy="3333750"/>
+                    </a:xfrm>
+                    <a:prstGeom prst="rect">
+                      <a:avLst/>
+                    </a:prstGeom>
+                  </pic:spPr>
+                </pic:pic>
+              </a:graphicData>
+            </a:graphic>
+          </wp:inline>
+        </w:drawing>
+      </w:r>
+    </w:p>
+    <w:p>
+      <w:pPr>
+        <w:spacing w:after="200"/>
+        <w:jc w:val="center"/>
+      </w:pPr>
+      <w:r>
+        <w:rPr>
+          <w:i/>
+          <w:iCs/>
+          <w:sz w:val="18"/>
+          <w:szCs w:val="18"/>
+        </w:rPr>
+        <w:t xml:space="preserve">Fig. 21. Export page</w:t>
       </w:r>
     </w:p>
     <w:p>

</xml_diff>